<commit_message>
Update resume with current numbers: 60+ competitors, 14 students, 200+ companies, 2,200+ members, CALICO Bronze
</commit_message>
<xml_diff>
--- a/resume/Andrew Li Resume.docx
+++ b/resume/Andrew Li Resume.docx
@@ -50,7 +50,7 @@
         <w:pBdr>
           <w:bottom w:val="single" w:sz="6" w:space="2" w:color="444444"/>
         </w:pBdr>
-        <w:spacing w:before="100" w:after="40"/>
+        <w:spacing w:before="70" w:after="30"/>
       </w:pPr>
       <w:r>
         <w:rPr>
@@ -68,7 +68,7 @@
         <w:tabs>
           <w:tab w:val="right" w:pos="9026"/>
         </w:tabs>
-        <w:spacing w:before="30" w:after="20"/>
+        <w:spacing w:before="20" w:after="15"/>
       </w:pPr>
       <w:r>
         <w:rPr>
@@ -99,7 +99,7 @@
         <w:tabs>
           <w:tab w:val="right" w:pos="9026"/>
         </w:tabs>
-        <w:spacing w:before="80" w:after="20"/>
+        <w:spacing w:before="60" w:after="15"/>
       </w:pPr>
       <w:r>
         <w:rPr>
@@ -130,7 +130,7 @@
         <w:pBdr>
           <w:bottom w:val="single" w:sz="6" w:space="2" w:color="444444"/>
         </w:pBdr>
-        <w:spacing w:before="100" w:after="40"/>
+        <w:spacing w:before="70" w:after="30"/>
       </w:pPr>
       <w:r>
         <w:rPr>
@@ -148,7 +148,7 @@
         <w:tabs>
           <w:tab w:val="right" w:pos="9026"/>
         </w:tabs>
-        <w:spacing w:before="30" w:after="20"/>
+        <w:spacing w:before="20" w:after="15"/>
       </w:pPr>
       <w:r>
         <w:rPr>
@@ -179,7 +179,7 @@
         <w:spacing w:after="20"/>
       </w:pPr>
       <w:r>
-        <w:t>Built and launched a Science Olympics team-management platform now used by my school's program, with role-based access for teachers, executives, and competitors.</w:t>
+        <w:t>Built and launched a Science Olympics team-management platform used by 60+ competitors, with role-based access for teachers, executives, and competitors.</w:t>
       </w:r>
     </w:p>
     <w:p>
@@ -213,7 +213,7 @@
         <w:tabs>
           <w:tab w:val="right" w:pos="9026"/>
         </w:tabs>
-        <w:spacing w:before="80" w:after="20"/>
+        <w:spacing w:before="60" w:after="15"/>
       </w:pPr>
       <w:r>
         <w:rPr>
@@ -265,7 +265,7 @@
         <w:tabs>
           <w:tab w:val="right" w:pos="9026"/>
         </w:tabs>
-        <w:spacing w:before="80" w:after="20"/>
+        <w:spacing w:before="60" w:after="15"/>
       </w:pPr>
       <w:r>
         <w:rPr>
@@ -330,7 +330,7 @@
         <w:tabs>
           <w:tab w:val="right" w:pos="9026"/>
         </w:tabs>
-        <w:spacing w:before="80" w:after="20"/>
+        <w:spacing w:before="60" w:after="15"/>
       </w:pPr>
       <w:r>
         <w:rPr>
@@ -369,7 +369,7 @@
         <w:pBdr>
           <w:bottom w:val="single" w:sz="6" w:space="2" w:color="444444"/>
         </w:pBdr>
-        <w:spacing w:before="100" w:after="40"/>
+        <w:spacing w:before="70" w:after="30"/>
       </w:pPr>
       <w:r>
         <w:rPr>
@@ -387,7 +387,7 @@
         <w:tabs>
           <w:tab w:val="right" w:pos="9026"/>
         </w:tabs>
-        <w:spacing w:before="30" w:after="20"/>
+        <w:spacing w:before="20" w:after="15"/>
       </w:pPr>
       <w:r>
         <w:rPr>
@@ -418,20 +418,20 @@
         <w:spacing w:after="20"/>
       </w:pPr>
       <w:r>
-        <w:t>Taught a 5-week Introduction to C++ course to university students; students progressed from no C++ experience to writing functional programs.</w:t>
-      </w:r>
-    </w:p>
-    <w:p>
-      <w:pPr>
-        <w:pStyle w:val="ListParagraph"/>
-        <w:numPr>
-          <w:ilvl w:val="0"/>
-          <w:numId w:val="2"/>
-        </w:numPr>
-        <w:spacing w:after="20"/>
-      </w:pPr>
-      <w:r>
-        <w:t>Coordinate sponsor and partnership outreach supporting free technology education programs.</w:t>
+        <w:t>Taught a 5-week Introduction to C++ course to 14 university students; by the end, beginners were confidently shipping functional C++ programs.</w:t>
+      </w:r>
+    </w:p>
+    <w:p>
+      <w:pPr>
+        <w:pStyle w:val="ListParagraph"/>
+        <w:numPr>
+          <w:ilvl w:val="0"/>
+          <w:numId w:val="2"/>
+        </w:numPr>
+        <w:spacing w:after="20"/>
+      </w:pPr>
+      <w:r>
+        <w:t>Reached out to 200+ companies to secure sponsorships and partnerships for the 2,200+-member organization.</w:t>
       </w:r>
     </w:p>
     <w:p>
@@ -439,14 +439,14 @@
         <w:tabs>
           <w:tab w:val="right" w:pos="9026"/>
         </w:tabs>
-        <w:spacing w:before="80" w:after="20"/>
+        <w:spacing w:before="60" w:after="15"/>
       </w:pPr>
       <w:r>
         <w:rPr>
           <w:b/>
           <w:bCs/>
         </w:rPr>
-        <w:t>Science Olympics Club, Victoria Park CI</w:t>
+        <w:t>Science Olympics Team, Victoria Park CI</w:t>
       </w:r>
       <w:r>
         <w:rPr>
@@ -483,7 +483,20 @@
         <w:spacing w:after="20"/>
       </w:pPr>
       <w:r>
-        <w:t>Designed the club's first structured training program and recruited experienced competitors as trainers, then built OlympIQ to run scheduling and signups.</w:t>
+        <w:t>Created the team's first structured training program and recruited experienced competitors as trainers.</w:t>
+      </w:r>
+    </w:p>
+    <w:p>
+      <w:pPr>
+        <w:pStyle w:val="ListParagraph"/>
+        <w:numPr>
+          <w:ilvl w:val="0"/>
+          <w:numId w:val="2"/>
+        </w:numPr>
+        <w:spacing w:after="20"/>
+      </w:pPr>
+      <w:r>
+        <w:t>Then developed OlympIQ, which now runs scheduling and signups for the team.</w:t>
       </w:r>
     </w:p>
     <w:p>
@@ -491,7 +504,7 @@
         <w:pBdr>
           <w:bottom w:val="single" w:sz="6" w:space="2" w:color="444444"/>
         </w:pBdr>
-        <w:spacing w:before="100" w:after="40"/>
+        <w:spacing w:before="70" w:after="30"/>
       </w:pPr>
       <w:r>
         <w:rPr>
@@ -527,7 +540,20 @@
         <w:spacing w:after="20"/>
       </w:pPr>
       <w:r>
-        <w:t>USACO Silver Division; DMOJ top 2% (300+ points); Codeforces max rating 1200+; 500+ problems solved</w:t>
+        <w:t>DMOJ top 2% (300+ points); Codeforces rating 1200+; USACO Silver Division; 500+ problems solved</w:t>
+      </w:r>
+    </w:p>
+    <w:p>
+      <w:pPr>
+        <w:pStyle w:val="ListParagraph"/>
+        <w:numPr>
+          <w:ilvl w:val="0"/>
+          <w:numId w:val="2"/>
+        </w:numPr>
+        <w:spacing w:after="20"/>
+      </w:pPr>
+      <w:r>
+        <w:t>CALICO Bronze, 2024</w:t>
       </w:r>
     </w:p>
     <w:p>
@@ -561,7 +587,7 @@
         <w:pBdr>
           <w:bottom w:val="single" w:sz="6" w:space="2" w:color="444444"/>
         </w:pBdr>
-        <w:spacing w:before="100" w:after="40"/>
+        <w:spacing w:before="70" w:after="30"/>
       </w:pPr>
       <w:r>
         <w:rPr>
@@ -614,96 +640,10 @@
 <file path=word/numbering.xml><?xml version="1.0" encoding="utf-8"?>
 <w:numbering xmlns:wpc="http://schemas.microsoft.com/office/word/2010/wordprocessingCanvas" xmlns:cx="http://schemas.microsoft.com/office/drawing/2014/chartex" xmlns:cx1="http://schemas.microsoft.com/office/drawing/2015/9/8/chartex" xmlns:cx2="http://schemas.microsoft.com/office/drawing/2015/10/21/chartex" xmlns:cx3="http://schemas.microsoft.com/office/drawing/2016/5/9/chartex" xmlns:cx4="http://schemas.microsoft.com/office/drawing/2016/5/10/chartex" xmlns:cx5="http://schemas.microsoft.com/office/drawing/2016/5/11/chartex" xmlns:cx6="http://schemas.microsoft.com/office/drawing/2016/5/12/chartex" xmlns:cx7="http://schemas.microsoft.com/office/drawing/2016/5/13/chartex" xmlns:cx8="http://schemas.microsoft.com/office/drawing/2016/5/14/chartex" xmlns:mc="http://schemas.openxmlformats.org/markup-compatibility/2006" xmlns:aink="http://schemas.microsoft.com/office/drawing/2016/ink" xmlns:am3d="http://schemas.microsoft.com/office/drawing/2017/model3d" xmlns:o="urn:schemas-microsoft-com:office:office" xmlns:oel="http://schemas.microsoft.com/office/2019/extlst" xmlns:r="http://schemas.openxmlformats.org/officeDocument/2006/relationships" xmlns:m="http://schemas.openxmlformats.org/officeDocument/2006/math" xmlns:v="urn:schemas-microsoft-com:vml" xmlns:wp14="http://schemas.microsoft.com/office/word/2010/wordprocessingDrawing" xmlns:wp="http://schemas.openxmlformats.org/drawingml/2006/wordprocessingDrawing" xmlns:w10="urn:schemas-microsoft-com:office:word" xmlns:w="http://schemas.openxmlformats.org/wordprocessingml/2006/main" xmlns:w14="http://schemas.microsoft.com/office/word/2010/wordml" xmlns:w15="http://schemas.microsoft.com/office/word/2012/wordml" xmlns:w16cex="http://schemas.microsoft.com/office/word/2018/wordml/cex" xmlns:w16cid="http://schemas.microsoft.com/office/word/2016/wordml/cid" xmlns:w16="http://schemas.microsoft.com/office/word/2018/wordml" xmlns:w16du="http://schemas.microsoft.com/office/word/2023/wordml/word16du" xmlns:w16sdtdh="http://schemas.microsoft.com/office/word/2020/wordml/sdtdatahash" xmlns:w16sdtfl="http://schemas.microsoft.com/office/word/2024/wordml/sdtformatlock" xmlns:w16se="http://schemas.microsoft.com/office/word/2015/wordml/symex" xmlns:wpg="http://schemas.microsoft.com/office/word/2010/wordprocessingGroup" xmlns:wpi="http://schemas.microsoft.com/office/word/2010/wordprocessingInk" xmlns:wne="http://schemas.microsoft.com/office/word/2006/wordml" xmlns:wps="http://schemas.microsoft.com/office/word/2010/wordprocessingShape" mc:Ignorable="w14 w15 w16se w16cid w16 w16cex w16sdtdh w16sdtfl w16du wp14">
   <w:abstractNum w:abstractNumId="0" w15:restartNumberingAfterBreak="0">
-    <w:nsid w:val="236058BA"/>
+    <w:nsid w:val="3DDC5B1E"/>
     <w:multiLevelType w:val="hybridMultilevel"/>
-    <w:tmpl w:val="F8846122"/>
-    <w:lvl w:ilvl="0" w:tplc="AA167C6C">
-      <w:start w:val="1"/>
-      <w:numFmt w:val="bullet"/>
-      <w:lvlText w:val="●"/>
-      <w:lvlJc w:val="left"/>
-      <w:pPr>
-        <w:ind w:left="720" w:hanging="360"/>
-      </w:pPr>
-    </w:lvl>
-    <w:lvl w:ilvl="1" w:tplc="CEC614D4">
-      <w:start w:val="1"/>
-      <w:numFmt w:val="bullet"/>
-      <w:lvlText w:val="○"/>
-      <w:lvlJc w:val="left"/>
-      <w:pPr>
-        <w:ind w:left="1440" w:hanging="360"/>
-      </w:pPr>
-    </w:lvl>
-    <w:lvl w:ilvl="2" w:tplc="81F61F66">
-      <w:start w:val="1"/>
-      <w:numFmt w:val="bullet"/>
-      <w:lvlText w:val="■"/>
-      <w:lvlJc w:val="left"/>
-      <w:pPr>
-        <w:ind w:left="2160" w:hanging="360"/>
-      </w:pPr>
-    </w:lvl>
-    <w:lvl w:ilvl="3" w:tplc="0A5CCC74">
-      <w:start w:val="1"/>
-      <w:numFmt w:val="bullet"/>
-      <w:lvlText w:val="●"/>
-      <w:lvlJc w:val="left"/>
-      <w:pPr>
-        <w:ind w:left="2880" w:hanging="360"/>
-      </w:pPr>
-    </w:lvl>
-    <w:lvl w:ilvl="4" w:tplc="3A5E8E4C">
-      <w:start w:val="1"/>
-      <w:numFmt w:val="bullet"/>
-      <w:lvlText w:val="○"/>
-      <w:lvlJc w:val="left"/>
-      <w:pPr>
-        <w:ind w:left="3600" w:hanging="360"/>
-      </w:pPr>
-    </w:lvl>
-    <w:lvl w:ilvl="5" w:tplc="8780B402">
-      <w:start w:val="1"/>
-      <w:numFmt w:val="bullet"/>
-      <w:lvlText w:val="■"/>
-      <w:lvlJc w:val="left"/>
-      <w:pPr>
-        <w:ind w:left="4320" w:hanging="360"/>
-      </w:pPr>
-    </w:lvl>
-    <w:lvl w:ilvl="6" w:tplc="4BAEA750">
-      <w:start w:val="1"/>
-      <w:numFmt w:val="bullet"/>
-      <w:lvlText w:val="●"/>
-      <w:lvlJc w:val="left"/>
-      <w:pPr>
-        <w:ind w:left="5040" w:hanging="360"/>
-      </w:pPr>
-    </w:lvl>
-    <w:lvl w:ilvl="7" w:tplc="2E18B9C6">
-      <w:start w:val="1"/>
-      <w:numFmt w:val="bullet"/>
-      <w:lvlText w:val="●"/>
-      <w:lvlJc w:val="left"/>
-      <w:pPr>
-        <w:ind w:left="5760" w:hanging="360"/>
-      </w:pPr>
-    </w:lvl>
-    <w:lvl w:ilvl="8" w:tplc="8B2446A6">
-      <w:start w:val="1"/>
-      <w:numFmt w:val="bullet"/>
-      <w:lvlText w:val="●"/>
-      <w:lvlJc w:val="left"/>
-      <w:pPr>
-        <w:ind w:left="6480" w:hanging="360"/>
-      </w:pPr>
-    </w:lvl>
-  </w:abstractNum>
-  <w:abstractNum w:abstractNumId="1" w15:restartNumberingAfterBreak="0">
-    <w:nsid w:val="354C7540"/>
-    <w:multiLevelType w:val="hybridMultilevel"/>
-    <w:tmpl w:val="CCDA4A9E"/>
-    <w:lvl w:ilvl="0" w:tplc="02A6E84E">
+    <w:tmpl w:val="97D2F706"/>
+    <w:lvl w:ilvl="0" w:tplc="663C8EFA">
       <w:start w:val="1"/>
       <w:numFmt w:val="bullet"/>
       <w:lvlText w:val="•"/>
@@ -712,55 +652,141 @@
         <w:ind w:left="340" w:hanging="170"/>
       </w:pPr>
     </w:lvl>
-    <w:lvl w:ilvl="1" w:tplc="A80428BC">
+    <w:lvl w:ilvl="1" w:tplc="7BDC0FD2">
       <w:numFmt w:val="decimal"/>
       <w:lvlText w:val=""/>
       <w:lvlJc w:val="left"/>
     </w:lvl>
-    <w:lvl w:ilvl="2" w:tplc="121C1120">
+    <w:lvl w:ilvl="2" w:tplc="7144CB98">
       <w:numFmt w:val="decimal"/>
       <w:lvlText w:val=""/>
       <w:lvlJc w:val="left"/>
     </w:lvl>
-    <w:lvl w:ilvl="3" w:tplc="6CD6AAFA">
+    <w:lvl w:ilvl="3" w:tplc="2A8CA2D0">
       <w:numFmt w:val="decimal"/>
       <w:lvlText w:val=""/>
       <w:lvlJc w:val="left"/>
     </w:lvl>
-    <w:lvl w:ilvl="4" w:tplc="B7641E5C">
+    <w:lvl w:ilvl="4" w:tplc="B5E6D96C">
       <w:numFmt w:val="decimal"/>
       <w:lvlText w:val=""/>
       <w:lvlJc w:val="left"/>
     </w:lvl>
-    <w:lvl w:ilvl="5" w:tplc="01847F2C">
+    <w:lvl w:ilvl="5" w:tplc="93942358">
       <w:numFmt w:val="decimal"/>
       <w:lvlText w:val=""/>
       <w:lvlJc w:val="left"/>
     </w:lvl>
-    <w:lvl w:ilvl="6" w:tplc="38C06510">
+    <w:lvl w:ilvl="6" w:tplc="2CB0D45C">
       <w:numFmt w:val="decimal"/>
       <w:lvlText w:val=""/>
       <w:lvlJc w:val="left"/>
     </w:lvl>
-    <w:lvl w:ilvl="7" w:tplc="8D626544">
+    <w:lvl w:ilvl="7" w:tplc="4ECC79E6">
       <w:numFmt w:val="decimal"/>
       <w:lvlText w:val=""/>
       <w:lvlJc w:val="left"/>
     </w:lvl>
-    <w:lvl w:ilvl="8" w:tplc="804C6266">
+    <w:lvl w:ilvl="8" w:tplc="12B05E4C">
       <w:numFmt w:val="decimal"/>
       <w:lvlText w:val=""/>
       <w:lvlJc w:val="left"/>
     </w:lvl>
   </w:abstractNum>
-  <w:num w:numId="1" w16cid:durableId="1239947407">
-    <w:abstractNumId w:val="0"/>
+  <w:abstractNum w:abstractNumId="1" w15:restartNumberingAfterBreak="0">
+    <w:nsid w:val="732056AA"/>
+    <w:multiLevelType w:val="hybridMultilevel"/>
+    <w:tmpl w:val="3370A28C"/>
+    <w:lvl w:ilvl="0" w:tplc="77D22E74">
+      <w:start w:val="1"/>
+      <w:numFmt w:val="bullet"/>
+      <w:lvlText w:val="●"/>
+      <w:lvlJc w:val="left"/>
+      <w:pPr>
+        <w:ind w:left="720" w:hanging="360"/>
+      </w:pPr>
+    </w:lvl>
+    <w:lvl w:ilvl="1" w:tplc="6486F9EA">
+      <w:start w:val="1"/>
+      <w:numFmt w:val="bullet"/>
+      <w:lvlText w:val="○"/>
+      <w:lvlJc w:val="left"/>
+      <w:pPr>
+        <w:ind w:left="1440" w:hanging="360"/>
+      </w:pPr>
+    </w:lvl>
+    <w:lvl w:ilvl="2" w:tplc="0AACD6FA">
+      <w:start w:val="1"/>
+      <w:numFmt w:val="bullet"/>
+      <w:lvlText w:val="■"/>
+      <w:lvlJc w:val="left"/>
+      <w:pPr>
+        <w:ind w:left="2160" w:hanging="360"/>
+      </w:pPr>
+    </w:lvl>
+    <w:lvl w:ilvl="3" w:tplc="DCE49E9E">
+      <w:start w:val="1"/>
+      <w:numFmt w:val="bullet"/>
+      <w:lvlText w:val="●"/>
+      <w:lvlJc w:val="left"/>
+      <w:pPr>
+        <w:ind w:left="2880" w:hanging="360"/>
+      </w:pPr>
+    </w:lvl>
+    <w:lvl w:ilvl="4" w:tplc="89366CB2">
+      <w:start w:val="1"/>
+      <w:numFmt w:val="bullet"/>
+      <w:lvlText w:val="○"/>
+      <w:lvlJc w:val="left"/>
+      <w:pPr>
+        <w:ind w:left="3600" w:hanging="360"/>
+      </w:pPr>
+    </w:lvl>
+    <w:lvl w:ilvl="5" w:tplc="4C908698">
+      <w:start w:val="1"/>
+      <w:numFmt w:val="bullet"/>
+      <w:lvlText w:val="■"/>
+      <w:lvlJc w:val="left"/>
+      <w:pPr>
+        <w:ind w:left="4320" w:hanging="360"/>
+      </w:pPr>
+    </w:lvl>
+    <w:lvl w:ilvl="6" w:tplc="1338BCF6">
+      <w:start w:val="1"/>
+      <w:numFmt w:val="bullet"/>
+      <w:lvlText w:val="●"/>
+      <w:lvlJc w:val="left"/>
+      <w:pPr>
+        <w:ind w:left="5040" w:hanging="360"/>
+      </w:pPr>
+    </w:lvl>
+    <w:lvl w:ilvl="7" w:tplc="C04CC734">
+      <w:start w:val="1"/>
+      <w:numFmt w:val="bullet"/>
+      <w:lvlText w:val="●"/>
+      <w:lvlJc w:val="left"/>
+      <w:pPr>
+        <w:ind w:left="5760" w:hanging="360"/>
+      </w:pPr>
+    </w:lvl>
+    <w:lvl w:ilvl="8" w:tplc="921805D0">
+      <w:start w:val="1"/>
+      <w:numFmt w:val="bullet"/>
+      <w:lvlText w:val="●"/>
+      <w:lvlJc w:val="left"/>
+      <w:pPr>
+        <w:ind w:left="6480" w:hanging="360"/>
+      </w:pPr>
+    </w:lvl>
+  </w:abstractNum>
+  <w:num w:numId="1" w16cid:durableId="1629775639">
+    <w:abstractNumId w:val="1"/>
     <w:lvlOverride w:ilvl="0">
       <w:startOverride w:val="1"/>
     </w:lvlOverride>
   </w:num>
-  <w:num w:numId="2" w16cid:durableId="1376076278">
-    <w:abstractNumId w:val="1"/>
+  <w:num w:numId="2" w16cid:durableId="1580167776">
+    <w:abstractNumId w:val="0"/>
     <w:lvlOverride w:ilvl="0">
       <w:startOverride w:val="1"/>
     </w:lvlOverride>

</xml_diff>